<commit_message>
fix(autobericht): harden persistence and add chapter 0 context
</commit_message>
<xml_diff>
--- a/AutoBericht/project-template/templates/Vorlage IST-Aufnahme-Bericht d.V01.docx
+++ b/AutoBericht/project-template/templates/Vorlage IST-Aufnahme-Bericht d.V01.docx
@@ -2596,28 +2596,8 @@
       <w:bookmarkEnd w:id="6"/>
     </w:p>
     <w:p>
-      <w:pPr>
-        <w:spacing w:after="160"/>
-      </w:pPr>
-      <w:r>
-        <w:t xml:space="preserve">Bei der </w:t>
-      </w:r>
-      <w:r>
-        <w:t>COMPANY$$</w:t>
-      </w:r>
-      <w:r>
-        <w:t xml:space="preserve"> hat die Arbeitssicherheit hat in den letzten Jahren mit der zunehmenden Grösse des Unternehmens an Stellenwert gewonnen. Mit der Schulung «Verantwortung in der Arbeitssicherheit» anlässlich des Kaderanlasses im März 2018 konnte die Sensibilisierung der Vorgesetzten weiter aufgebaut werden. Verschiedene Arbeitsgruppen haben nach der Schulung Verbesserungsmassnahmen eingeleitet und umgesetzt. Bei unserem Betriebsrundgang hat sich gezeigt, dass die Sensibilisierung inzwischen auch wieder etwas nachgelassen hat. </w:t>
-      </w:r>
-    </w:p>
-    <w:p>
-      <w:r>
-        <w:t xml:space="preserve">Die Unfallhäufigkeit der </w:t>
-      </w:r>
-      <w:r>
-        <w:t>COMPANY$$</w:t>
-      </w:r>
-      <w:r>
-        <w:t xml:space="preserve"> liegt über dem Branchendurchschnitt. Das Ziel ist, die Anzahl der Berufsunfälle deutlich zu reduzieren. </w:t>
+      <w:r>
+        <w:t>CHAPTER0_FRONT_MATTER$$</w:t>
       </w:r>
     </w:p>
     <w:p>

</xml_diff>